<commit_message>
Add random seed configuration
</commit_message>
<xml_diff>
--- a/reports/MedalCare_ECGdeli_Labelling_Report.docx
+++ b/reports/MedalCare_ECGdeli_Labelling_Report.docx
@@ -2402,8 +2402,7 @@
           <w:sz w:val="24"/>
           <w:szCs w:val="24"/>
         </w:rPr>
-        <w:lastRenderedPageBreak/>
-        <w:t xml:space="preserve">Schema, ms = sample×2, and presence flags all verified with zero errors. The full run then labelled all 16,848 records, producing 2,646,204 beat-lead fiducial rows in </w:t>
+        <w:t>Schema, ms = sample×2, and presence flags all verified with zero errors. The full run then labelled all 16,848 records, producing 2,646,204 beat-lead fiducial rows in medalcare_fiducials_ecgdeli.csv. The full run used the raw (noise-free) signal version with ECGdeli's isoline correction applied before annotation — the preprocessing configuration retained from the Section 4.4 sweep.</w:t>
       </w:r>
       <w:r>
         <w:rPr>
@@ -2412,7 +2411,6 @@
           <w:sz w:val="24"/>
           <w:szCs w:val="24"/>
         </w:rPr>
-        <w:t>medalcare_fiducials_ecgdeli.csv.</w:t>
       </w:r>
     </w:p>
     <w:p>
@@ -2752,7 +2750,7 @@
           <w:sz w:val="24"/>
           <w:szCs w:val="24"/>
         </w:rPr>
-        <w:t>CRITICAL - review or exclude - a structural QRS-order violation, a QRS/QT/PR interval outside a predefined plausibility range, a gross P/T boundary inversion (&gt; 20 samples ≈ 40 ms), or a missing R peak.</w:t>
+        <w:t>CRITICAL - review or exclude - a structural QRS-order violation; a QRS, QT or PR interval outside its plausibility range (QRS duration 40–200 ms, QT 250–700 ms, PR 80–400 ms); a gross P/T boundary inversion (&gt; 20 samples ≈ 40 ms); or a missing R peak.</w:t>
       </w:r>
     </w:p>
     <w:p>
@@ -4285,7 +4283,7 @@
           <w:sz w:val="24"/>
           <w:szCs w:val="24"/>
         </w:rPr>
-        <w:t>We extracted the same six timing biomarkers from our ECGdeli labels on the healthy sinus cohort, across roughly 200,000 beat–lead observations over all twelve leads, and compared the per-lead means against the simulated values in Table 6 of the published paper. Given that that reference was also produced with ECGdeli, the consistency check here assesses whether we drive the tool similarly to the authors, as we don’t have an independent ground-truth validation. Table 6 is the only per-lead numeric reference the descriptor provides: the preprint gives only the lead-II Figure 5 and the per-class Figure 6, with no equivalent table, so the per-lead comparison below is necessarily against the published paper’s Table 6. As Section 4.6 shows, QT differs systematically between Table 6 and the preprint, so the QT row documents a reference discrepancy rather than independently validating either value.</w:t>
+        <w:t>We extracted the same six timing biomarkers from our ECGdeli labels on the healthy sinus cohort, across roughly 200,000 beat–lead observations over all twelve leads, and compared the per-lead means against the simulated values in Table 6 of the published paper. Given that that reference was also produced with ECGdeli, the consistency check here assesses whether we drive the tool similarly to the authors, as we don’t have an independent ground-truth validation. Table 6 is the only per-lead numeric reference the descriptor provides: the preprint gives only the lead-II Figure 5 and the per-class Figure 6, with no equivalent table, so the per-lead comparison below is necessarily against the published paper’s Table 6. As Section 4.6 shows, QT differs systematically between Table 6 and the preprint, so the QT row documents a reference discrepancy rather than independently validating either value. The present analysis assesses consistency with the published MedalCare-XL simulated cohort; it does not independently reproduce the comparison with the clinical PTB-XL population or establish that the simulated distributions represent the full clinical population.</w:t>
       </w:r>
       <w:r>
         <w:rPr>
@@ -6387,7 +6385,7 @@
           <w:sz w:val="24"/>
           <w:szCs w:val="24"/>
         </w:rPr>
-        <w:t>To turn the Table 6 check into a thorough reproducibility test, we recomputed every population statistic the descriptor reports: the healthy timing means and their standard deviations, the five amplitude features, and the per-class distributions of the descriptor's Figure 6. Timing statistics were computed from the complete set of 2,646,204 beat–lead annotations and then aggregated to one median value per recording and lead. The amplitude analyses used targeted samples, because retrieving voltages requires loading the corresponding raw signal files: 200 healthy recordings for the all-lead comparison and 100 recordings per class for the Figure 6 contrasts. Amplitudes were read as the raw signal voltage at each detected peak relative to a per-beat isoelectric baseline (median of the twelve samples ending at QRS onset). Each MedalCare-XL ECG is synthesised from common P-wave and QRST templates, while successive beats vary in RR timing and in the stretch or compression of the QRS-offset–T-offset segment; aggregating to one value per record matches the paper's per-ECG extraction. The computation was done in Python (pandas/NumPy); an equivalent MATLAB script, reproduce_paper_stats.m, is kept alongside the pipeline.</w:t>
+        <w:t>To turn the Table 6 check into a thorough reproducibility test, we recomputed every population statistic the descriptor reports: the healthy timing means and their standard deviations, the five amplitude features, and the per-class distributions of the descriptor's Figure 6. Timing statistics were computed from the complete set of 2,646,204 beat–lead annotations and then aggregated to one median value per recording and lead. The amplitude analyses used reproducible random samples (seed 2026), because retrieving voltages requires loading the corresponding raw signal files: 200 healthy recordings for the all-lead comparison and 100 recordings per class for the Figure 6 contrasts. Amplitudes were read as the raw signal voltage at each detected peak relative to a per-beat isoelectric baseline (median of the twelve samples ending at QRS onset). Each MedalCare-XL ECG is synthesised from common P-wave and QRST templates, while successive beats vary in RR timing and in the stretch or compression of the QRS-offset–T-offset segment; aggregating to one value per record matches the paper's per-ECG extraction. The computation was done in Python (pandas/NumPy); an equivalent MATLAB script, reproduce_paper_stats.m, is kept alongside the pipeline.</w:t>
       </w:r>
     </w:p>
     <w:p>
@@ -7152,7 +7150,7 @@
     </w:tbl>
     <w:p>
       <w:r>
-        <w:t>Amplitude. The five amplitude features reproduce the published values to within 0.19 mV (the maximum, on the R wave; all-lead mean absolute differences over a 200-record sample) and recover the expected lead-wise polarity (R positive in I/II/V5/V6, negative in aVR/V1–V3). Residual differences, largest for R, may reflect the baseline definition, lead-specific peak placement, or fiducial differences.</w:t>
+        <w:t>Amplitude. The five amplitude features reproduce the published values to within 0.04 mV (the maximum, on the R wave) and recover the expected lead-wise polarity (R positive in I/II/V5/V6, negative in aVR/V1–V3), agreeing in sign on all twelve leads. These are all-lead mean absolute differences over a reproducible random sample of 200 healthy recordings (seed 2026); an earlier first-in-file sample overstated the R-wave difference (0.19 mV) because the leading records were not representative of the cohort's amplitude scaling.</w:t>
       </w:r>
     </w:p>
     <w:tbl>
@@ -7343,7 +7341,7 @@
                 <w:sz w:val="24"/>
                 <w:szCs w:val="24"/>
               </w:rPr>
-              <w:t>0.05</w:t>
+              <w:t>0.02</w:t>
             </w:r>
           </w:p>
         </w:tc>
@@ -7364,7 +7362,7 @@
                 <w:sz w:val="24"/>
                 <w:szCs w:val="24"/>
               </w:rPr>
-              <w:t>11/12</w:t>
+              <w:t>12/12</w:t>
             </w:r>
           </w:p>
         </w:tc>
@@ -7409,7 +7407,7 @@
                 <w:sz w:val="24"/>
                 <w:szCs w:val="24"/>
               </w:rPr>
-              <w:t>0.19</w:t>
+              <w:t>0.04</w:t>
             </w:r>
           </w:p>
         </w:tc>
@@ -7430,7 +7428,7 @@
                 <w:sz w:val="24"/>
                 <w:szCs w:val="24"/>
               </w:rPr>
-              <w:t>11/12</w:t>
+              <w:t>12/12</w:t>
             </w:r>
           </w:p>
         </w:tc>
@@ -7475,7 +7473,7 @@
                 <w:sz w:val="24"/>
                 <w:szCs w:val="24"/>
               </w:rPr>
-              <w:t>0.03</w:t>
+              <w:t>0.01</w:t>
             </w:r>
           </w:p>
         </w:tc>
@@ -7541,7 +7539,7 @@
                 <w:sz w:val="24"/>
                 <w:szCs w:val="24"/>
               </w:rPr>
-              <w:t>0.06</w:t>
+              <w:t>0.03</w:t>
             </w:r>
           </w:p>
         </w:tc>
@@ -8409,7 +8407,7 @@
     </w:p>
     <w:p>
       <w:r>
-        <w:t>Distributions. Overlaying the density of each healthy biomarker on the reference Gaussians shows broad agreement for several features, not exact equality of shape. Each panel carries the applicable references: the published Table 6 Gaussian (dashed) and the preprint Figure 5 (solid). Because the preprint publishes only probability-density plots (no numeric table), its curves are centred on the Figure 5 values with widths borrowed from the Table 6 standard deviation. Among the directly comparable timing features, P-wave duration, QRS duration, T-wave duration, and RR interval lie close to both reference curves, while QT separates the references. The atrioventricular timing panel instead compares our PRint with the preprint only, because Table 6 reports the different PQint measure; the amplitudes broadly overlap both references.</w:t>
+        <w:t>Distributions. Overlaying the density of each healthy biomarker on the reference Gaussians shows broad agreement for several features, not exact equality of shape. Each panel carries the applicable references: the published Table 6 Gaussian (dashed) and the preprint Figure 5 (solid). Because the preprint publishes only probability-density plots (no numeric table), its curves are centred on the Figure 5 values with widths borrowed from the Table 6 standard deviation. Among the directly comparable timing features, P-wave duration, QRS duration, T-wave duration, and RR interval lie close to both reference curves, while QT separates the references. The atrioventricular timing panel instead compares our PRint with the preprint only, because Table 6 reports the different PQint measure; the amplitudes broadly overlap both references. The Gaussian overlays summarise the marginal mean and spread of each biomarker separately; they do not evaluate the multivariate relationships used during ECG synthesis.</w:t>
       </w:r>
     </w:p>
     <w:p>
@@ -8666,7 +8664,7 @@
           <w:sz w:val="24"/>
           <w:szCs w:val="24"/>
         </w:rPr>
-        <w:t>Four directly comparable non-QT timing features—P-wave duration, QRS duration, T-wave duration and RR interval—are close to both published references. The atrioventricular timing feature differs in definition between the two versions of the descriptor: the preprint reports PRint, measured from P-wave onset to the R peak, whereas the published Table 6 reports PQint, measured from P-wave onset to QRS onset. Our corresponding lead-II values are 187 ms for PRint, close to the preprint estimate of approximately 190 ms, and 124 ms for PQint, close to the published Table 6 value of 127 ms. QT remains the only directly comparable timing feature showing a large numerical discrepancy between the two references: our value of 386 ms is close to the preprint estimate of approximately 385 ms, but not to the published Table 6 value of 317 ms. Figure 6's per-class shifts also reproduce (wider QRS in RBBB/LBBB, prolonged PR in AV block, wider P in IAB/LAE, prolonged QT in MI), and the R/S/T amplitudes broadly match, while P and Q amplitudes are low in the relevant leads. An independent manual delineation of one ECG by the supervisor gave a lead-II QT of 364 ms, closer to our labels than to 317 ms, but this is one example and is not an independent ground truth.</w:t>
+        <w:t>Four directly comparable non-QT timing features—P-wave duration, QRS duration, T-wave duration and RR interval—are close to both published references. The atrioventricular timing feature differs in definition between the two versions of the descriptor: the preprint reports PRint, measured from P-wave onset to the R peak, whereas the published Table 6 reports PQint, measured from P-wave onset to QRS onset. Our corresponding lead-II values are 187 ms for PRint, close to the preprint estimate of approximately 190 ms, and 124 ms for PQint, close to the published Table 6 value of 127 ms. QT remains the only directly comparable timing feature showing a large numerical discrepancy between the two references: our value of 386 ms is close to the preprint estimate of approximately 385 ms, but not to the published Table 6 value of 317 ms. Figure 6's per-class shifts also reproduce (wider QRS in RBBB/LBBB, prolonged PR in AV block, wider P in IAB/LAE, prolonged QT in MI), and the R/S/T amplitudes broadly match, while the P-wave amplitude runs slightly low in the relevant leads. An independent manual delineation of one ECG by the supervisor gave a lead-II QT of 364 ms, closer to our labels than to 317 ms, but this is one example and is not an independent ground truth.</w:t>
       </w:r>
     </w:p>
     <w:p>
@@ -8741,7 +8739,7 @@
           <w:sz w:val="24"/>
           <w:szCs w:val="24"/>
         </w:rPr>
-        <w:t>Beyond the healthy lead-II panels of Figure 5, we also reproduced the per-class contrasts of Figure 6 (disease vs healthy, in the disease-relevant lead). Every timing shift moves in the direction the figure shows: QRS duration widens in RBBB (+5 ms) and LBBB (+12 ms), the PR interval prolongs in AV block (+94 ms), P duration widens in IAB (+8 ms) and LAE (+11 ms), and QT prolongs in myocardial infarction at V4 (+12 ms). The amplitude panels agree too: MI changes the Q amplitude in lead II (-0.02 to +0.14 mV) and the R amplitude in V2 (-2.41 to -2.90 mV), while fibrotic atrial cardiomyopathy reduces the P-wave amplitude in aVL (0.043 to 0.008 mV) and V6 (0.076 to 0.060 mV); left atrial enlargement leaves the R amplitude unchanged, as expected for an atrial condition. So, the labels reproduce the reported population-level feature changes not only for the healthy population but also for the disease-specific contrasts that Figure 6 was designed to show. (Each Figure 6 amplitude contrast uses a 100-record sample per class; the healthy lead-II amplitude comparison in Section 4.5 uses 200 records, and its all-lead summary is in amplitudes_alllead_sinus.csv.)</w:t>
+        <w:t>Beyond the healthy lead-II panels of Figure 5, we also reproduced the per-class contrasts of Figure 6 (disease vs healthy, in the disease-relevant lead). Every timing shift moves in the direction the figure shows: QRS duration widens in RBBB (+5 ms) and LBBB (+12 ms), the PR interval prolongs in AV block (+94 ms), P duration widens in IAB (+8 ms) and LAE (+11 ms), and QT prolongs in myocardial infarction at V4 (+12 ms). The amplitude panels agree too: MI changes the Q amplitude in lead II (0.05 to 0.13 mV) and the R amplitude in V2 (−1.49 to −2.08 mV), while fibrotic atrial cardiomyopathy reduces the P-wave amplitude in aVL (0.035 to 0.014 mV) and V6 (0.084 to 0.049 mV); left atrial enlargement leaves the R amplitude little changed (0.55 to 0.50 mV), as expected for an atrial condition. So, the labels reproduce the reported population-level feature changes not only for the healthy population but also for the disease-specific contrasts that Figure 6 was designed to show. (Each Figure 6 amplitude contrast uses a reproducible random sample of 100 recordings per class (seed 2026); the healthy lead-II amplitude comparison in Section 4.5 uses 200 records, and its all-lead summary is in amplitudes_alllead_sinus.csv.)</w:t>
       </w:r>
     </w:p>
     <w:p>
@@ -8769,7 +8767,7 @@
           <w:sz w:val="24"/>
           <w:szCs w:val="24"/>
         </w:rPr>
-        <w:t>As a final, independent check, the ECGdeli labels were cross-checked against NeuroKit2, a separate open-source delineator that uses a discrete wavelet method and shares no code with ECGdeli. The check was run over the entire dataset, all 16,848 records and all twelve leads. Each ECGdeli beat was matched one-to-one to its nearest NeuroKit2 beat by R-peak within tolerance (each NeuroKit2 beat is used at most once); because successive beats are separated by roughly an RR interval, far larger than the matching tolerance, re-running with strict one-to-one matching left every agreement figure unchanged. The number of matched beats varies by fiducial, from about 1.52 million (T-offset) to 2.00 million (R-peak). For each fiducial we recorded the fraction of matched beats on which the two tools agree within a per-fiducial tolerance, together with the median difference (NeuroKit2 minus ECGdeli).</w:t>
+        <w:t>As a final, independent check, the ECGdeli labels were cross-checked against NeuroKit2, a separate open-source delineator that uses a discrete wavelet method and shares no code with ECGdeli. The check was run over the entire dataset, all 16,848 records and all twelve leads. Each ECGdeli beat was matched one-to-one to its nearest NeuroKit2 beat by R-peak within tolerance (each NeuroKit2 beat is used at most once); because successive beats are separated by roughly an RR interval, far larger than the matching tolerance, re-running with strict one-to-one matching left every agreement figure unchanged. The number of matched beats varies by fiducial, from about 1.52 million (T-offset) to 2.00 million (R-peak). For each fiducial we recorded the fraction of matched beats on which the two tools agree within a per-fiducial tolerance, together with the median difference (NeuroKit2 minus ECGdeli). The agreement tolerance was set per fiducial: 15 ms for the R-peak, 20–30 ms for the other peaks (P 25, Q 20, S 20, T 30 ms), and 25–50 ms for the wave boundaries (QRS on/off 25 ms, P on/off 40 ms, T on/off 50 ms).</w:t>
       </w:r>
     </w:p>
     <w:tbl>
@@ -10103,52 +10101,12 @@
         <w:pStyle w:val="Heading1"/>
       </w:pPr>
       <w:r>
-        <w:t>Appendix — Code and data availability</w:t>
+        <w:t>Code and data availability</w:t>
       </w:r>
     </w:p>
     <w:p>
       <w:r>
-        <w:t>All code and configuration for the pipeline described in this report are version-controlled in the project repository (https://github.com/john-thuo1/delineation-). Run order, file paths and quality-control thresholds are documented in the repository README and in config/paths.yaml and config/pipeline_settings.yaml; every figure, table and statistic above is reproducible from the scripts listed below. The ECGdeli labelling (the master fiducials table) is the one fixed input, treated as described in Section 3.</w:t>
-      </w:r>
-    </w:p>
-    <w:p>
-      <w:r>
-        <w:t>Delineation driver (Section 3): ecgdeli_labelling/scripts/run_ecgdeli_medalcare.m</w:t>
-      </w:r>
-    </w:p>
-    <w:p>
-      <w:r>
-        <w:t>Quality control (Sections 4.1–4.2): ecgdeli_labelling/scripts/qc_review_list.py</w:t>
-      </w:r>
-    </w:p>
-    <w:p>
-      <w:r>
-        <w:t>ECGdeli preprocessing sweep and scoring (Section 4.4): ecgdeli_labelling/scripts/ecgdeli_config_sweep.m and statistics/scripts/score_vs_table6.py</w:t>
-      </w:r>
-    </w:p>
-    <w:p>
-      <w:r>
-        <w:t>Population statistics and figures (Sections 4.5–4.6): statistics/scripts/build_per_signal_stats.py, build_comparison_figure.py, build_gaussian_overlays.py and reproduce_paper_stats.py</w:t>
-      </w:r>
-    </w:p>
-    <w:p>
-      <w:r>
-        <w:t>Independent cross-checks (Section 4.7): ecgdeli_labelling/scripts/crosscheck_neurokit.py, crosscheck_neurokit_peak.py and build_review_targets.py</w:t>
-      </w:r>
-    </w:p>
-    <w:p>
-      <w:r>
-        <w:t>Training-set assembly and QC columns (Section 5): dataset_curation/scripts/build_master.py, add_qc_status.py, add_crosscheck_qc.py and build_manual_worklist.py</w:t>
-      </w:r>
-    </w:p>
-    <w:p>
-      <w:r>
-        <w:t>Single-record signal-and-label views (which regenerate on demand the kind of per-signal example shown during development): dataset_curation/scripts/extract_signal.py</w:t>
-      </w:r>
-    </w:p>
-    <w:p>
-      <w:r>
-        <w:t>Data. The raw 12-lead signals are the MedalCare-XL release; the ECGdeli toolbox is from KIT-IBT (github.com/KIT-IBT/ECGdeli). The large derived tables (the master fiducials, master_labels.csv and the NeuroKit disagreement files) are regenerable with the scripts above and are therefore excluded from the repository, while the small report-featured summary tables are included.</w:t>
+        <w:t>The code used to generate the ECGdeli pseudo-labels, perform quality control, reproduce the population statistics, conduct the NeuroKit2 cross-check, and assemble the curated dataset is available at https://github.com/john-thuo1/delineation-. The version corresponding to this report is identified by commit [commit hash] (or release tag). Execution order, software dependencies, configuration parameters, and output-file descriptions are documented in the repository README. The original MedalCare-XL signals and the ECGdeli toolbox are obtained from their respective public sources. Large derived CSV files are excluded from the repository because of their size but can be regenerated using the supplied scripts.</w:t>
       </w:r>
     </w:p>
     <w:sectPr>

</xml_diff>

<commit_message>
Add CSE_2SD  acceptance limits
</commit_message>
<xml_diff>
--- a/reports/MedalCare_ECGdeli_Labelling_Report.docx
+++ b/reports/MedalCare_ECGdeli_Labelling_Report.docx
@@ -141,7 +141,21 @@
           <w:sz w:val="24"/>
           <w:szCs w:val="24"/>
         </w:rPr>
-        <w:t xml:space="preserve">data descriptor). </w:t>
+        <w:t>data descriptor</w:t>
+      </w:r>
+      <w:r>
+        <w:rPr>
+          <w:sz w:val="24"/>
+          <w:szCs w:val="24"/>
+        </w:rPr>
+        <w:t xml:space="preserve"> + preprint</w:t>
+      </w:r>
+      <w:r>
+        <w:rPr>
+          <w:sz w:val="24"/>
+          <w:szCs w:val="24"/>
+        </w:rPr>
+        <w:t xml:space="preserve">). </w:t>
       </w:r>
     </w:p>
     <w:p>
@@ -1881,7 +1895,21 @@
           <w:sz w:val="24"/>
           <w:szCs w:val="24"/>
         </w:rPr>
-        <w:t>Output Convention - sample indices are 0-based; milliseconds = sample × 1000 / 500. Disease class and, for infarction, the MI subclass are carried on every row: mi_subclass holds the detailed label (LAD/LCX/RCA at each severity, with the LCX anterior/posterior variant) and mi_group holds the normalised six-category group, so morphology information is never lost.</w:t>
+        <w:t>Output Convention - sample indices are 0-based</w:t>
+      </w:r>
+      <w:r>
+        <w:rPr>
+          <w:sz w:val="24"/>
+          <w:szCs w:val="24"/>
+        </w:rPr>
+        <w:t xml:space="preserve">, </w:t>
+      </w:r>
+      <w:r>
+        <w:rPr>
+          <w:sz w:val="24"/>
+          <w:szCs w:val="24"/>
+        </w:rPr>
+        <w:t>milliseconds = sample × 1000 / 500. Disease class and, for infarction, the MI subclass are carried on every row: mi_subclass holds the detailed label (LAD/LCX/RCA at each severity, with the LCX anterior/posterior variant) and mi_group holds the normalised six-category group, so morphology information is never lost.</w:t>
       </w:r>
     </w:p>
     <w:p>
@@ -2025,9 +2053,9 @@
         <w:tblLook w:val="04A0" w:firstRow="1" w:lastRow="0" w:firstColumn="1" w:lastColumn="0" w:noHBand="0" w:noVBand="1"/>
       </w:tblPr>
       <w:tblGrid>
-        <w:gridCol w:w="3619"/>
-        <w:gridCol w:w="1269"/>
-        <w:gridCol w:w="4976"/>
+        <w:gridCol w:w="3640"/>
+        <w:gridCol w:w="1266"/>
+        <w:gridCol w:w="4958"/>
       </w:tblGrid>
       <w:tr>
         <w:trPr>
@@ -2335,6 +2363,7 @@
                 <w:sz w:val="24"/>
                 <w:szCs w:val="24"/>
               </w:rPr>
+              <w:lastRenderedPageBreak/>
               <w:t>Heart rate</w:t>
             </w:r>
           </w:p>
@@ -2403,14 +2432,6 @@
           <w:szCs w:val="24"/>
         </w:rPr>
         <w:t>Schema, ms = sample×2, and presence flags all verified with zero errors. The full run then labelled all 16,848 records, producing 2,646,204 beat-lead fiducial rows in medalcare_fiducials_ecgdeli.csv. The full run used the raw (noise-free) signal version with ECGdeli's isoline correction applied before annotation — the preprocessing configuration retained from the Section 4.4 sweep.</w:t>
-      </w:r>
-      <w:r>
-        <w:rPr>
-          <w:b/>
-          <w:bCs/>
-          <w:sz w:val="24"/>
-          <w:szCs w:val="24"/>
-        </w:rPr>
       </w:r>
     </w:p>
     <w:p>
@@ -2643,28 +2664,7 @@
           <w:sz w:val="24"/>
           <w:szCs w:val="24"/>
         </w:rPr>
-        <w:t xml:space="preserve">The automated QC screen targets two readily testable classes of annotation failure: violations of expected temporal ordering and derived intervals outside predefined plausibility ranges. It does not detect every possible </w:t>
-      </w:r>
-      <w:r>
-        <w:rPr>
-          <w:sz w:val="24"/>
-          <w:szCs w:val="24"/>
-        </w:rPr>
-        <w:t>localization</w:t>
-      </w:r>
-      <w:r>
-        <w:rPr>
-          <w:sz w:val="24"/>
-          <w:szCs w:val="24"/>
-        </w:rPr>
-        <w:t xml:space="preserve"> error, particularly consistently shifted but physiologically plausible boundaries.</w:t>
-      </w:r>
-      <w:r>
-        <w:rPr>
-          <w:sz w:val="24"/>
-          <w:szCs w:val="24"/>
-        </w:rPr>
-        <w:t xml:space="preserve"> </w:t>
+        <w:t xml:space="preserve">The automated QC screen targets two readily testable classes of annotation failure: violations of expected temporal ordering and derived intervals outside predefined plausibility ranges. It does not detect every possible localization error, particularly consistently shifted but physiologically plausible boundaries. </w:t>
       </w:r>
     </w:p>
     <w:p>
@@ -2802,41 +2802,8 @@
           <w:sz w:val="24"/>
           <w:szCs w:val="24"/>
         </w:rPr>
+        <w:lastRenderedPageBreak/>
         <w:t>Two outputs are written -&gt; medalcare_qc_review_list.csv (one row per CRITICAL beat, with its failure reasons and key fiducial samples) and medalcare_qc_record_summary.csv (every record ranked worst-first by critical rate). The full code is in the repository (ecgdeli_labelling/scripts/qc_review_list.py; see the Code and data availability appendix).</w:t>
-      </w:r>
-      <w:r>
-        <w:rPr>
-          <w:sz w:val="24"/>
-          <w:szCs w:val="24"/>
-        </w:rPr>
-      </w:r>
-      <w:r>
-        <w:rPr>
-          <w:b/>
-          <w:bCs/>
-          <w:sz w:val="24"/>
-          <w:szCs w:val="24"/>
-        </w:rPr>
-      </w:r>
-      <w:r>
-        <w:rPr>
-          <w:sz w:val="24"/>
-          <w:szCs w:val="24"/>
-        </w:rPr>
-      </w:r>
-      <w:r>
-        <w:rPr>
-          <w:b/>
-          <w:bCs/>
-          <w:sz w:val="24"/>
-          <w:szCs w:val="24"/>
-        </w:rPr>
-      </w:r>
-      <w:r>
-        <w:rPr>
-          <w:sz w:val="24"/>
-          <w:szCs w:val="24"/>
-        </w:rPr>
       </w:r>
     </w:p>
     <w:p>
@@ -2847,7 +2814,6 @@
         <w:rPr>
           <w:rFonts w:ascii="Garamond" w:hAnsi="Garamond" w:cs="Garamond"/>
         </w:rPr>
-        <w:lastRenderedPageBreak/>
         <w:t>4.2 QC results</w:t>
       </w:r>
     </w:p>
@@ -3744,6 +3710,7 @@
                 <w:sz w:val="24"/>
                 <w:szCs w:val="24"/>
               </w:rPr>
+              <w:lastRenderedPageBreak/>
               <w:t>avblock</w:t>
             </w:r>
           </w:p>
@@ -4130,7 +4097,6 @@
                 <w:b/>
                 <w:sz w:val="18"/>
               </w:rPr>
-              <w:lastRenderedPageBreak/>
               <w:t>lae</w:t>
             </w:r>
           </w:p>
@@ -4285,14 +4251,6 @@
         </w:rPr>
         <w:t>We extracted the same six timing biomarkers from our ECGdeli labels on the healthy sinus cohort, across roughly 200,000 beat–lead observations over all twelve leads, and compared the per-lead means against the simulated values in Table 6 of the published paper. Given that that reference was also produced with ECGdeli, the consistency check here assesses whether we drive the tool similarly to the authors, as we don’t have an independent ground-truth validation. Table 6 is the only per-lead numeric reference the descriptor provides: the preprint gives only the lead-II Figure 5 and the per-class Figure 6, with no equivalent table, so the per-lead comparison below is necessarily against the published paper’s Table 6. As Section 4.6 shows, QT differs systematically between Table 6 and the preprint, so the QT row documents a reference discrepancy rather than independently validating either value. The present analysis assesses consistency with the published MedalCare-XL simulated cohort; it does not independently reproduce the comparison with the clinical PTB-XL population or establish that the simulated distributions represent the full clinical population.</w:t>
       </w:r>
-      <w:r>
-        <w:rPr>
-          <w:b/>
-          <w:bCs/>
-          <w:sz w:val="24"/>
-          <w:szCs w:val="24"/>
-        </w:rPr>
-      </w:r>
     </w:p>
     <w:tbl>
       <w:tblPr>
@@ -6027,6 +5985,7 @@
                 <w:sz w:val="24"/>
                 <w:szCs w:val="24"/>
               </w:rPr>
+              <w:lastRenderedPageBreak/>
               <w:t>V5</w:t>
             </w:r>
           </w:p>
@@ -6436,6 +6395,7 @@
                 <w:sz w:val="24"/>
                 <w:szCs w:val="24"/>
               </w:rPr>
+              <w:lastRenderedPageBreak/>
               <w:t>Feature</w:t>
             </w:r>
           </w:p>
@@ -7688,7 +7648,6 @@
                 <w:b/>
                 <w:sz w:val="18"/>
               </w:rPr>
-              <w:lastRenderedPageBreak/>
               <w:t>AV block</w:t>
             </w:r>
           </w:p>
@@ -8268,6 +8227,7 @@
         <w:rPr>
           <w:noProof/>
         </w:rPr>
+        <w:lastRenderedPageBreak/>
         <w:drawing>
           <wp:inline distT="0" distB="0" distL="0" distR="0" wp14:anchorId="0139F687" wp14:editId="27B33A9D">
             <wp:extent cx="5760720" cy="2843900"/>
@@ -8401,7 +8361,6 @@
           <w:i/>
           <w:sz w:val="18"/>
         </w:rPr>
-        <w:lastRenderedPageBreak/>
         <w:t>Healthy sinus amplitude features (lead II): our labels, all beats pooled, shown without a paper overlay.</w:t>
       </w:r>
     </w:p>
@@ -8418,6 +8377,7 @@
         <w:rPr>
           <w:noProof/>
         </w:rPr>
+        <w:lastRenderedPageBreak/>
         <w:drawing>
           <wp:inline distT="0" distB="0" distL="0" distR="0" wp14:anchorId="6B8EFDE2" wp14:editId="67AEB74E">
             <wp:extent cx="5760720" cy="2861221"/>
@@ -8537,7 +8497,15 @@
           <w:sz w:val="24"/>
           <w:szCs w:val="24"/>
         </w:rPr>
-        <w:t>In short, the relabelling reproduces the MedalCare-XL published population statistics across timing means, spreads, amplitudes and disease-class structure, with QT closer to the descriptor's preprint (Section 4.6) than to the published Table 6. Because the paper's features were also produced by ECGdeli, this confirms reproducibility of the pipeline, not absolute accuracy, which is why the QT is compared against the preprint and cross-checked with NeuroKit2 below. Averaging ECGdeli with NeuroKit2 was also tested and moves every biomarker further from Table 6 (the paper's reference is itself ECGdeli-derived), so combining tools was not pursued.</w:t>
+        <w:t xml:space="preserve">In short, the relabelling reproduces the MedalCare-XL published population statistics across timing means, spreads, amplitudes and disease-class structure, with QT closer to the descriptor's preprint (Section 4.6) than to the published Table 6. Because the paper's features were also produced by ECGdeli, this confirms reproducibility of the pipeline, not absolute accuracy, which is why the QT is compared against the preprint and cross-checked with NeuroKit2 below. Averaging ECGdeli with </w:t>
+      </w:r>
+      <w:r>
+        <w:rPr>
+          <w:sz w:val="24"/>
+          <w:szCs w:val="24"/>
+        </w:rPr>
+        <w:lastRenderedPageBreak/>
+        <w:t>NeuroKit2 was also tested and moves every biomarker further from Table 6 (the paper's reference is itself ECGdeli-derived), so combining tools was not pursued.</w:t>
       </w:r>
     </w:p>
     <w:p>
@@ -8715,6 +8683,7 @@
           <w:i/>
           <w:sz w:val="18"/>
         </w:rPr>
+        <w:lastRenderedPageBreak/>
         <w:t>Healthy sinus, lead II: per-recording median densities compared with the applicable reference values. P-wave duration, QRS duration, T-wave duration, and RR interval are directly comparable between the preprint and Table 6. The atrioventricular panel compares PRint with the preprint only, because Table 6 instead reports PQint. Among the directly comparable features, QT is the only substantial reference discrepancy, with our distribution closer to the preprint.</w:t>
       </w:r>
     </w:p>
@@ -8767,7 +8736,41 @@
           <w:sz w:val="24"/>
           <w:szCs w:val="24"/>
         </w:rPr>
-        <w:t>As a final, independent check, the ECGdeli labels were cross-checked against NeuroKit2, a separate open-source delineator that uses a discrete wavelet method and shares no code with ECGdeli. The check was run over the entire dataset, all 16,848 records and all twelve leads. Each ECGdeli beat was matched one-to-one to its nearest NeuroKit2 beat by R-peak within tolerance (each NeuroKit2 beat is used at most once); because successive beats are separated by roughly an RR interval, far larger than the matching tolerance, re-running with strict one-to-one matching left every agreement figure unchanged. The number of matched beats varies by fiducial, from about 1.52 million (T-offset) to 2.00 million (R-peak). For each fiducial we recorded the fraction of matched beats on which the two tools agree within a per-fiducial tolerance, together with the median difference (NeuroKit2 minus ECGdeli). The agreement tolerance was set per fiducial: 15 ms for the R-peak, 20–30 ms for the other peaks (P 25, Q 20, S 20, T 30 ms), and 25–50 ms for the wave boundaries (QRS on/off 25 ms, P on/off 40 ms, T on/off 50 ms).</w:t>
+        <w:t>As a final, independent check, the ECGdeli labels were cross-checked against NeuroKit2, a separate open-source delineator that uses a discrete wavelet method and shares no code with ECGdeli. The check was run over the entire dataset, all 16,848 records and all twelve leads. Each ECGdeli beat was paired with the NeuroKit2 beat having the nearest R-peak, provided that the R-peak difference fell within the predefined matching window. Matching was constrained to be one-to-one, so each NeuroKit2 beat could be assigned to at most one ECGdeli beat. Enforcing this uniqueness constraint did not change the resulting agreement statistics. This is plausible because successive beats are separated by approximately one RR interval, which is much longer than the R-peak matching window.</w:t>
+      </w:r>
+    </w:p>
+    <w:p>
+      <w:pPr>
+        <w:spacing w:after="120"/>
+        <w:jc w:val="both"/>
+        <w:rPr>
+          <w:sz w:val="24"/>
+          <w:szCs w:val="24"/>
+        </w:rPr>
+      </w:pPr>
+      <w:r>
+        <w:rPr>
+          <w:sz w:val="24"/>
+          <w:szCs w:val="24"/>
+        </w:rPr>
+        <w:t>The number of available matched pairs varied by fiducial, from approximately 1.52 million for T-offset to 2.00 million for R-peak, because one or both tools did not identify every fiducial on every matched beat. For each fiducial, agreement was defined as the proportion of matched pairs whose absolute timing difference fell within a predefined tolerance. We also calculated the median signed difference, defined as NeuroKit2 minus ECGdeli, to indicate whether NeuroKit2 tended to place the fiducial earlier or later.</w:t>
+      </w:r>
+    </w:p>
+    <w:p>
+      <w:pPr>
+        <w:spacing w:after="120"/>
+        <w:jc w:val="both"/>
+        <w:rPr>
+          <w:sz w:val="24"/>
+          <w:szCs w:val="24"/>
+        </w:rPr>
+      </w:pPr>
+      <w:r>
+        <w:rPr>
+          <w:sz w:val="24"/>
+          <w:szCs w:val="24"/>
+        </w:rPr>
+        <w:t>We summarise the comparison in two complementary ways. The first is an investigator-defined operational agreement — the proportion of matched pairs whose absolute timing difference falls within a per-fiducial comparison band chosen to reflect how sharply each landmark can be localised: 15 ms for the R-peak; 25, 20, 20 and 30 ms for the P-, Q-, S- and T-peaks, respectively; 25 ms for QRS onset and offset; 40 ms for P-wave onset and offset; and 50 ms for T-wave onset and offset. The second is the mean, standard deviation and median of the signed difference (NeuroKit2 minus ECGdeli) per fiducial; for the five wave boundaries that have one we report the CSE Working Party two-standard-deviation acceptance limit as a citable external reference (CSE Working Party, Eur. Heart J. 1985;6:815–825; used as a delineation benchmark by Martínez et al. 2004, IEEE TBME 51(4), and by a recent single-lead wearable-ECG delineator assessment that evaluated both ECGdeli and NeuroKit2).</w:t>
       </w:r>
     </w:p>
     <w:tbl>
@@ -9356,7 +9359,677 @@
           <w:sz w:val="24"/>
           <w:szCs w:val="24"/>
         </w:rPr>
-        <w:t>Agreement is the share of matched beats within tolerance; a positive median means NeuroKit2 places the point later than ECGdeli. The T-peak and T-offset rows are highlighted. Because R-peaks were used for beat matching, the R-peak row is not an independent validation.</w:t>
+        <w:t>Operational within-band agreement: the share of matched pairs whose difference falls within the investigator-defined per-fiducial band above (a review-oriented measure, not a standard tolerance); a positive median means NeuroKit2 places the point later than ECGdeli. The T-peak and T-offset rows are highlighted; because R-peaks were used for matching, the R-peak row is not an independent validation.</w:t>
+      </w:r>
+    </w:p>
+    <w:tbl>
+      <w:tblPr>
+        <w:tblStyle w:val="TableGrid"/>
+        <w:tblW w:type="auto" w:w="0"/>
+        <w:tblLook w:firstColumn="1" w:firstRow="1" w:lastColumn="0" w:lastRow="0" w:noHBand="0" w:noVBand="1" w:val="04A0"/>
+      </w:tblPr>
+      <w:tblGrid>
+        <w:gridCol w:w="1930"/>
+        <w:gridCol w:w="1930"/>
+        <w:gridCol w:w="1930"/>
+        <w:gridCol w:w="1930"/>
+        <w:gridCol w:w="1930"/>
+      </w:tblGrid>
+      <w:tr>
+        <w:tc>
+          <w:tcPr>
+            <w:tcW w:type="dxa" w:w="1930"/>
+          </w:tcPr>
+          <w:p>
+            <w:r>
+              <w:rPr>
+                <w:b/>
+              </w:rPr>
+              <w:t>Fiducial</w:t>
+            </w:r>
+          </w:p>
+        </w:tc>
+        <w:tc>
+          <w:tcPr>
+            <w:tcW w:type="dxa" w:w="1930"/>
+          </w:tcPr>
+          <w:p>
+            <w:r>
+              <w:rPr>
+                <w:b/>
+              </w:rPr>
+              <w:t>Mean Δ (ms)</w:t>
+            </w:r>
+          </w:p>
+        </w:tc>
+        <w:tc>
+          <w:tcPr>
+            <w:tcW w:type="dxa" w:w="1930"/>
+          </w:tcPr>
+          <w:p>
+            <w:r>
+              <w:rPr>
+                <w:b/>
+              </w:rPr>
+              <w:t>SD (ms)</w:t>
+            </w:r>
+          </w:p>
+        </w:tc>
+        <w:tc>
+          <w:tcPr>
+            <w:tcW w:type="dxa" w:w="1930"/>
+          </w:tcPr>
+          <w:p>
+            <w:r>
+              <w:rPr>
+                <w:b/>
+              </w:rPr>
+              <w:t>Median Δ (ms)</w:t>
+            </w:r>
+          </w:p>
+        </w:tc>
+        <w:tc>
+          <w:tcPr>
+            <w:tcW w:type="dxa" w:w="1930"/>
+          </w:tcPr>
+          <w:p>
+            <w:r>
+              <w:rPr>
+                <w:b/>
+              </w:rPr>
+              <w:t>2σ CSE (ms)</w:t>
+            </w:r>
+          </w:p>
+        </w:tc>
+      </w:tr>
+      <w:tr>
+        <w:tc>
+          <w:tcPr>
+            <w:tcW w:type="dxa" w:w="1930"/>
+          </w:tcPr>
+          <w:p>
+            <w:r>
+              <w:t>P onset</w:t>
+            </w:r>
+          </w:p>
+        </w:tc>
+        <w:tc>
+          <w:tcPr>
+            <w:tcW w:type="dxa" w:w="1930"/>
+          </w:tcPr>
+          <w:p>
+            <w:r>
+              <w:t>+34.5</w:t>
+            </w:r>
+          </w:p>
+        </w:tc>
+        <w:tc>
+          <w:tcPr>
+            <w:tcW w:type="dxa" w:w="1930"/>
+          </w:tcPr>
+          <w:p>
+            <w:r>
+              <w:t>64.2</w:t>
+            </w:r>
+          </w:p>
+        </w:tc>
+        <w:tc>
+          <w:tcPr>
+            <w:tcW w:type="dxa" w:w="1930"/>
+          </w:tcPr>
+          <w:p>
+            <w:r>
+              <w:t>+26</w:t>
+            </w:r>
+          </w:p>
+        </w:tc>
+        <w:tc>
+          <w:tcPr>
+            <w:tcW w:type="dxa" w:w="1930"/>
+          </w:tcPr>
+          <w:p>
+            <w:r>
+              <w:t>10.2</w:t>
+            </w:r>
+          </w:p>
+        </w:tc>
+      </w:tr>
+      <w:tr>
+        <w:tc>
+          <w:tcPr>
+            <w:tcW w:type="dxa" w:w="1930"/>
+          </w:tcPr>
+          <w:p>
+            <w:r>
+              <w:t>P peak</w:t>
+            </w:r>
+          </w:p>
+        </w:tc>
+        <w:tc>
+          <w:tcPr>
+            <w:tcW w:type="dxa" w:w="1930"/>
+          </w:tcPr>
+          <w:p>
+            <w:r>
+              <w:t>−2.1</w:t>
+            </w:r>
+          </w:p>
+        </w:tc>
+        <w:tc>
+          <w:tcPr>
+            <w:tcW w:type="dxa" w:w="1930"/>
+          </w:tcPr>
+          <w:p>
+            <w:r>
+              <w:t>53.1</w:t>
+            </w:r>
+          </w:p>
+        </w:tc>
+        <w:tc>
+          <w:tcPr>
+            <w:tcW w:type="dxa" w:w="1930"/>
+          </w:tcPr>
+          <w:p>
+            <w:r>
+              <w:t>+4</w:t>
+            </w:r>
+          </w:p>
+        </w:tc>
+        <w:tc>
+          <w:tcPr>
+            <w:tcW w:type="dxa" w:w="1930"/>
+          </w:tcPr>
+          <w:p>
+            <w:r>
+              <w:t>—</w:t>
+            </w:r>
+          </w:p>
+        </w:tc>
+      </w:tr>
+      <w:tr>
+        <w:tc>
+          <w:tcPr>
+            <w:tcW w:type="dxa" w:w="1930"/>
+          </w:tcPr>
+          <w:p>
+            <w:r>
+              <w:t>P offset</w:t>
+            </w:r>
+          </w:p>
+        </w:tc>
+        <w:tc>
+          <w:tcPr>
+            <w:tcW w:type="dxa" w:w="1930"/>
+          </w:tcPr>
+          <w:p>
+            <w:r>
+              <w:t>−27.9</w:t>
+            </w:r>
+          </w:p>
+        </w:tc>
+        <w:tc>
+          <w:tcPr>
+            <w:tcW w:type="dxa" w:w="1930"/>
+          </w:tcPr>
+          <w:p>
+            <w:r>
+              <w:t>48.5</w:t>
+            </w:r>
+          </w:p>
+        </w:tc>
+        <w:tc>
+          <w:tcPr>
+            <w:tcW w:type="dxa" w:w="1930"/>
+          </w:tcPr>
+          <w:p>
+            <w:r>
+              <w:t>−20</w:t>
+            </w:r>
+          </w:p>
+        </w:tc>
+        <w:tc>
+          <w:tcPr>
+            <w:tcW w:type="dxa" w:w="1930"/>
+          </w:tcPr>
+          <w:p>
+            <w:r>
+              <w:t>12.7</w:t>
+            </w:r>
+          </w:p>
+        </w:tc>
+      </w:tr>
+      <w:tr>
+        <w:tc>
+          <w:tcPr>
+            <w:tcW w:type="dxa" w:w="1930"/>
+          </w:tcPr>
+          <w:p>
+            <w:r>
+              <w:t>QRS onset</w:t>
+            </w:r>
+          </w:p>
+        </w:tc>
+        <w:tc>
+          <w:tcPr>
+            <w:tcW w:type="dxa" w:w="1930"/>
+          </w:tcPr>
+          <w:p>
+            <w:r>
+              <w:t>−46.2</w:t>
+            </w:r>
+          </w:p>
+        </w:tc>
+        <w:tc>
+          <w:tcPr>
+            <w:tcW w:type="dxa" w:w="1930"/>
+          </w:tcPr>
+          <w:p>
+            <w:r>
+              <w:t>53.4</w:t>
+            </w:r>
+          </w:p>
+        </w:tc>
+        <w:tc>
+          <w:tcPr>
+            <w:tcW w:type="dxa" w:w="1930"/>
+          </w:tcPr>
+          <w:p>
+            <w:r>
+              <w:t>−44</w:t>
+            </w:r>
+          </w:p>
+        </w:tc>
+        <w:tc>
+          <w:tcPr>
+            <w:tcW w:type="dxa" w:w="1930"/>
+          </w:tcPr>
+          <w:p>
+            <w:r>
+              <w:t>6.5</w:t>
+            </w:r>
+          </w:p>
+        </w:tc>
+      </w:tr>
+      <w:tr>
+        <w:tc>
+          <w:tcPr>
+            <w:tcW w:type="dxa" w:w="1930"/>
+          </w:tcPr>
+          <w:p>
+            <w:r>
+              <w:t>Q peak</w:t>
+            </w:r>
+          </w:p>
+        </w:tc>
+        <w:tc>
+          <w:tcPr>
+            <w:tcW w:type="dxa" w:w="1930"/>
+          </w:tcPr>
+          <w:p>
+            <w:r>
+              <w:t>−35.9</w:t>
+            </w:r>
+          </w:p>
+        </w:tc>
+        <w:tc>
+          <w:tcPr>
+            <w:tcW w:type="dxa" w:w="1930"/>
+          </w:tcPr>
+          <w:p>
+            <w:r>
+              <w:t>53.1</w:t>
+            </w:r>
+          </w:p>
+        </w:tc>
+        <w:tc>
+          <w:tcPr>
+            <w:tcW w:type="dxa" w:w="1930"/>
+          </w:tcPr>
+          <w:p>
+            <w:r>
+              <w:t>−24</w:t>
+            </w:r>
+          </w:p>
+        </w:tc>
+        <w:tc>
+          <w:tcPr>
+            <w:tcW w:type="dxa" w:w="1930"/>
+          </w:tcPr>
+          <w:p>
+            <w:r>
+              <w:t>—</w:t>
+            </w:r>
+          </w:p>
+        </w:tc>
+      </w:tr>
+      <w:tr>
+        <w:tc>
+          <w:tcPr>
+            <w:tcW w:type="dxa" w:w="1930"/>
+          </w:tcPr>
+          <w:p>
+            <w:r>
+              <w:t>R peak</w:t>
+            </w:r>
+          </w:p>
+        </w:tc>
+        <w:tc>
+          <w:tcPr>
+            <w:tcW w:type="dxa" w:w="1930"/>
+          </w:tcPr>
+          <w:p>
+            <w:r>
+              <w:t>−8.5</w:t>
+            </w:r>
+          </w:p>
+        </w:tc>
+        <w:tc>
+          <w:tcPr>
+            <w:tcW w:type="dxa" w:w="1930"/>
+          </w:tcPr>
+          <w:p>
+            <w:r>
+              <w:t>26.2</w:t>
+            </w:r>
+          </w:p>
+        </w:tc>
+        <w:tc>
+          <w:tcPr>
+            <w:tcW w:type="dxa" w:w="1930"/>
+          </w:tcPr>
+          <w:p>
+            <w:r>
+              <w:t>0</w:t>
+            </w:r>
+          </w:p>
+        </w:tc>
+        <w:tc>
+          <w:tcPr>
+            <w:tcW w:type="dxa" w:w="1930"/>
+          </w:tcPr>
+          <w:p>
+            <w:r>
+              <w:t>—</w:t>
+            </w:r>
+          </w:p>
+        </w:tc>
+      </w:tr>
+      <w:tr>
+        <w:tc>
+          <w:tcPr>
+            <w:tcW w:type="dxa" w:w="1930"/>
+          </w:tcPr>
+          <w:p>
+            <w:r>
+              <w:t>S peak</w:t>
+            </w:r>
+          </w:p>
+        </w:tc>
+        <w:tc>
+          <w:tcPr>
+            <w:tcW w:type="dxa" w:w="1930"/>
+          </w:tcPr>
+          <w:p>
+            <w:r>
+              <w:t>+36.3</w:t>
+            </w:r>
+          </w:p>
+        </w:tc>
+        <w:tc>
+          <w:tcPr>
+            <w:tcW w:type="dxa" w:w="1930"/>
+          </w:tcPr>
+          <w:p>
+            <w:r>
+              <w:t>99.7</w:t>
+            </w:r>
+          </w:p>
+        </w:tc>
+        <w:tc>
+          <w:tcPr>
+            <w:tcW w:type="dxa" w:w="1930"/>
+          </w:tcPr>
+          <w:p>
+            <w:r>
+              <w:t>+2</w:t>
+            </w:r>
+          </w:p>
+        </w:tc>
+        <w:tc>
+          <w:tcPr>
+            <w:tcW w:type="dxa" w:w="1930"/>
+          </w:tcPr>
+          <w:p>
+            <w:r>
+              <w:t>—</w:t>
+            </w:r>
+          </w:p>
+        </w:tc>
+      </w:tr>
+      <w:tr>
+        <w:tc>
+          <w:tcPr>
+            <w:tcW w:type="dxa" w:w="1930"/>
+          </w:tcPr>
+          <w:p>
+            <w:r>
+              <w:t>QRS offset</w:t>
+            </w:r>
+          </w:p>
+        </w:tc>
+        <w:tc>
+          <w:tcPr>
+            <w:tcW w:type="dxa" w:w="1930"/>
+          </w:tcPr>
+          <w:p>
+            <w:r>
+              <w:t>−10.3</w:t>
+            </w:r>
+          </w:p>
+        </w:tc>
+        <w:tc>
+          <w:tcPr>
+            <w:tcW w:type="dxa" w:w="1930"/>
+          </w:tcPr>
+          <w:p>
+            <w:r>
+              <w:t>43.9</w:t>
+            </w:r>
+          </w:p>
+        </w:tc>
+        <w:tc>
+          <w:tcPr>
+            <w:tcW w:type="dxa" w:w="1930"/>
+          </w:tcPr>
+          <w:p>
+            <w:r>
+              <w:t>−12</w:t>
+            </w:r>
+          </w:p>
+        </w:tc>
+        <w:tc>
+          <w:tcPr>
+            <w:tcW w:type="dxa" w:w="1930"/>
+          </w:tcPr>
+          <w:p>
+            <w:r>
+              <w:t>11.6</w:t>
+            </w:r>
+          </w:p>
+        </w:tc>
+      </w:tr>
+      <w:tr>
+        <w:tc>
+          <w:tcPr>
+            <w:tcW w:type="dxa" w:w="1930"/>
+          </w:tcPr>
+          <w:p>
+            <w:r>
+              <w:t>T onset</w:t>
+            </w:r>
+          </w:p>
+        </w:tc>
+        <w:tc>
+          <w:tcPr>
+            <w:tcW w:type="dxa" w:w="1930"/>
+          </w:tcPr>
+          <w:p>
+            <w:r>
+              <w:t>+34.2</w:t>
+            </w:r>
+          </w:p>
+        </w:tc>
+        <w:tc>
+          <w:tcPr>
+            <w:tcW w:type="dxa" w:w="1930"/>
+          </w:tcPr>
+          <w:p>
+            <w:r>
+              <w:t>61.5</w:t>
+            </w:r>
+          </w:p>
+        </w:tc>
+        <w:tc>
+          <w:tcPr>
+            <w:tcW w:type="dxa" w:w="1930"/>
+          </w:tcPr>
+          <w:p>
+            <w:r>
+              <w:t>+56</w:t>
+            </w:r>
+          </w:p>
+        </w:tc>
+        <w:tc>
+          <w:tcPr>
+            <w:tcW w:type="dxa" w:w="1930"/>
+          </w:tcPr>
+          <w:p>
+            <w:r>
+              <w:t>—</w:t>
+            </w:r>
+          </w:p>
+        </w:tc>
+      </w:tr>
+      <w:tr>
+        <w:tc>
+          <w:tcPr>
+            <w:tcW w:type="dxa" w:w="1930"/>
+          </w:tcPr>
+          <w:p>
+            <w:r>
+              <w:t>T peak</w:t>
+            </w:r>
+          </w:p>
+        </w:tc>
+        <w:tc>
+          <w:tcPr>
+            <w:tcW w:type="dxa" w:w="1930"/>
+          </w:tcPr>
+          <w:p>
+            <w:r>
+              <w:t>−22.1</w:t>
+            </w:r>
+          </w:p>
+        </w:tc>
+        <w:tc>
+          <w:tcPr>
+            <w:tcW w:type="dxa" w:w="1930"/>
+          </w:tcPr>
+          <w:p>
+            <w:r>
+              <w:t>67.3</w:t>
+            </w:r>
+          </w:p>
+        </w:tc>
+        <w:tc>
+          <w:tcPr>
+            <w:tcW w:type="dxa" w:w="1930"/>
+          </w:tcPr>
+          <w:p>
+            <w:r>
+              <w:t>−2</w:t>
+            </w:r>
+          </w:p>
+        </w:tc>
+        <w:tc>
+          <w:tcPr>
+            <w:tcW w:type="dxa" w:w="1930"/>
+          </w:tcPr>
+          <w:p>
+            <w:r>
+              <w:t>—</w:t>
+            </w:r>
+          </w:p>
+        </w:tc>
+      </w:tr>
+      <w:tr>
+        <w:tc>
+          <w:tcPr>
+            <w:tcW w:type="dxa" w:w="1930"/>
+          </w:tcPr>
+          <w:p>
+            <w:r>
+              <w:t>T offset</w:t>
+            </w:r>
+          </w:p>
+        </w:tc>
+        <w:tc>
+          <w:tcPr>
+            <w:tcW w:type="dxa" w:w="1930"/>
+          </w:tcPr>
+          <w:p>
+            <w:r>
+              <w:t>−25.5</w:t>
+            </w:r>
+          </w:p>
+        </w:tc>
+        <w:tc>
+          <w:tcPr>
+            <w:tcW w:type="dxa" w:w="1930"/>
+          </w:tcPr>
+          <w:p>
+            <w:r>
+              <w:t>64.2</w:t>
+            </w:r>
+          </w:p>
+        </w:tc>
+        <w:tc>
+          <w:tcPr>
+            <w:tcW w:type="dxa" w:w="1930"/>
+          </w:tcPr>
+          <w:p>
+            <w:r>
+              <w:t>−8</w:t>
+            </w:r>
+          </w:p>
+        </w:tc>
+        <w:tc>
+          <w:tcPr>
+            <w:tcW w:type="dxa" w:w="1930"/>
+          </w:tcPr>
+          <w:p>
+            <w:r>
+              <w:t>30.6</w:t>
+            </w:r>
+          </w:p>
+        </w:tc>
+      </w:tr>
+    </w:tbl>
+    <w:p>
+      <w:pPr>
+        <w:spacing w:after="160"/>
+        <w:jc w:val="both"/>
+        <w:rPr>
+          <w:sz w:val="24"/>
+          <w:szCs w:val="24"/>
+        </w:rPr>
+      </w:pPr>
+      <w:r>
+        <w:rPr>
+          <w:sz w:val="24"/>
+          <w:szCs w:val="24"/>
+        </w:rPr>
+        <w:t>Distribution of the per-fiducial signed difference (NeuroKit2 minus ECGdeli) across all matched pairs, with the CSE two-standard-deviation acceptance limit for the five boundaries that have one. The inter-tool SD exceeds the CSE reference for all five; as noted, these are contextual reference values for inter-tool variability on simulated ECGs, not accuracy criteria against expert annotations.</w:t>
       </w:r>
     </w:p>
     <w:p>
@@ -9370,11 +10043,10 @@
       </w:pPr>
       <w:r>
         <w:rPr>
-          <w:b/>
           <w:sz w:val="20"/>
           <w:szCs w:val="20"/>
         </w:rPr>
-        <w:t>The T-end receives partial independent support. Across the whole dataset and all twelve leads, the two tools agree on the T-peak 82.3 % of the time and on the T-offset 81.5 % of the time within the stated tolerances, with median differences of −2 ms and −8 ms. This shows majority agreement around the T-peak and T-offset, but the medians do not describe the full spread and do not prove that each label is accurate. The result makes a gross systematic T-offset displacement of approximately 70 ms less likely, while the QT difference between Table 6 and the preprint remains unresolved.</w:t>
+        <w:t>Read against the CSE reference, the standard deviation of the NeuroKit2-minus-ECGdeli differences exceeded the corresponding limit for all five boundaries for which a CSE value exists. These comparisons should be interpreted cautiously: the CSE limits describe localisation errors relative to expert annotations, whereas the present analysis compares two automated delineators on simulated ECGs, so they provide contextual reference values for inter-tool variability rather than formal accuracy criteria. The operational within-band proportions retain their own value — the two tools agree on the T-peak 82.3 % and the T-offset 81.5 % of the time within the stated bands, showing how frequently they were practically close. The small T-offset median difference (−8 ms) also makes a gross systematic T-offset displacement between the two tools unlikely, so the QT gap against Table 6 (Section 4.6) is not explained by a gross T-offset labelling disagreement; that reference discrepancy remains unresolved.</w:t>
       </w:r>
     </w:p>
     <w:p>
@@ -9383,12 +10055,9 @@
         <w:jc w:val="both"/>
       </w:pPr>
       <w:r>
-        <w:rPr>
-          <w:b/>
-        </w:rPr>
-        <w:t>Two fiducials show low agreement. NeuroKit2 places the QRS-onset ~44 ms earlier than ECGdeli, and the T-onset ~56 ms later. Because ECGdeli's QRS onset produces PQ, or clinical PR, intervals close to the published reference, it is retained as the project reference, but neither tool can be treated as ground truth. The T-onset is an ambiguous ST-to-T junction on which delineation conventions may differ. These offsets indicate systematic method differences and may include labelling error.</w:t>
+        <w:rPr/>
+        <w:t>The signed differences reveal systematic, method-dependent placement rather than only scatter. NeuroKit2 placed QRS onset about 44 ms earlier than ECGdeli at the median (mean −46.2 ms; the close mean and median indicate a genuine convention or placement difference, not merely outliers), and the T-onset about 56 ms later; P onset ran about 26 ms later and P offset about 20 ms earlier. Median differences were smaller for QRS offset and T offset (−12 and −8 ms), but their large standard deviations (43.9 and 64.2 ms) indicate substantial beat-level variability and outliers, concentrated in the low-amplitude and inverted-wave leads. Because ECGdeli's QRS onset produces PQ (clinical PR) intervals close to the published reference, it is retained as the project reference, but neither tool is treated as ground truth. Overall, ECGdeli and NeuroKit2 are corroborated in aggregate but are not interchangeable at beat-level boundary placement, most clearly for QRS onset.</w:t>
       </w:r>
-      <w:r/>
     </w:p>
     <w:p>
       <w:pPr>
@@ -9874,25 +10543,13 @@
     </w:p>
     <w:p>
       <w:pPr>
-        <w:pStyle w:val="Heading2"/>
+        <w:pStyle w:val="Heading1"/>
       </w:pPr>
       <w:r>
         <w:rPr>
           <w:rFonts w:ascii="Garamond" w:hAnsi="Garamond" w:cs="Garamond"/>
         </w:rPr>
-        <w:t>5.</w:t>
-      </w:r>
-      <w:r>
-        <w:rPr>
-          <w:rFonts w:ascii="Garamond" w:hAnsi="Garamond" w:cs="Garamond"/>
-        </w:rPr>
-        <w:t>1</w:t>
-      </w:r>
-      <w:r>
-        <w:rPr>
-          <w:rFonts w:ascii="Garamond" w:hAnsi="Garamond" w:cs="Garamond"/>
-        </w:rPr>
-        <w:t xml:space="preserve"> Quality-control status carried with each signal</w:t>
+        <w:t>5.  Quality-control status carried with each signal</w:t>
       </w:r>
     </w:p>
     <w:p>
@@ -10040,7 +10697,14 @@
               <w:rPr>
                 <w:sz w:val="18"/>
               </w:rPr>
-              <w:t>Some critical beats but no persistently flagged lead - lower-priority cases that an aligned per-record consensus may absorb.</w:t>
+              <w:t xml:space="preserve">Some critical beats but no persistently flagged lead - lower-priority cases that an </w:t>
+            </w:r>
+            <w:r>
+              <w:rPr>
+                <w:sz w:val="18"/>
+              </w:rPr>
+              <w:lastRenderedPageBreak/>
+              <w:t>aligned per-record consensus may absorb.</w:t>
             </w:r>
           </w:p>
         </w:tc>
@@ -10056,6 +10720,7 @@
                 <w:b/>
                 <w:sz w:val="18"/>
               </w:rPr>
+              <w:lastRenderedPageBreak/>
               <w:t>clean</w:t>
             </w:r>
           </w:p>

</xml_diff>